<commit_message>
checkpoint: web funcional (metro wasm, deps navigation, fix loading) + promocao unica inbox->hoje
</commit_message>
<xml_diff>
--- a/docs/MinhaRotina-PI-ABNT.docx
+++ b/docs/MinhaRotina-PI-ABNT.docx
@@ -167,7 +167,7 @@
           <w:sz w:val="24"/>
           <w:szCs w:val="24"/>
         </w:rPr>
-        <w:t xml:space="preserve">MINHA ROTINA: APLICATIVO MOBILE OFFLINE DE</w:t>
+        <w:t xml:space="preserve">MINHA ROTINA: APLICATIVO DE ORGANIZAÇÃO</w:t>
       </w:r>
     </w:p>
     <w:p>
@@ -456,7 +456,7 @@
           <w:sz w:val="24"/>
           <w:szCs w:val="24"/>
         </w:rPr>
-        <w:t xml:space="preserve">MINHA ROTINA: APLICATIVO MOBILE OFFLINE DE</w:t>
+        <w:t xml:space="preserve">MINHA ROTINA: APLICATIVO DE ORGANIZAÇÃO</w:t>
       </w:r>
     </w:p>
     <w:p>
@@ -689,7 +689,7 @@
           <w:sz w:val="24"/>
           <w:szCs w:val="24"/>
         </w:rPr>
-        <w:t xml:space="preserve">O presente Projeto Integrador tem como objetivo desenvolver uma aplicação mobile de organização de rotina voltada a adultos de 18 a 45 anos com rotina variável e dificuldades de memória prospectiva, utilizando React Native via Expo, TypeScript e SQLite local. O trabalho aborda as etapas de levantamento de requisitos, planejamento, modelagem, desenvolvimento e testes da aplicação, integrando diferentes áreas da tecnologia da informação, como Programação para Dispositivos Móveis, Programação Orientada a Objetos, Engenharia de Requisitos e Avaliação de Software. Para a construção do sistema, foi adotada metodologia de desenvolvimento incremental organizada em três sprints de duas semanas, com versionamento em Git, prototipação navegável em HTML e validação por critérios de aceite mensuráveis. A solução proposta é 100% local, em português, sem conta e sem internet: captura em inbox único em menos de 10 segundos, dia limitado a 3 prioridades com barra de progresso visual, checklist de saída no ponto de ação e temporizador Pomodoro de 25 minutos por bloco de foco. Além disso, o projeto busca evidenciar a importância da interdisciplinaridade na formação acadêmica e profissional dos estudantes, aproximando-os das demandas reais do mercado de trabalho. Como resultado, foi desenvolvido um protótipo funcional e a base do aplicativo com persistência local capaz de atender aos objetivos propostos, demonstrando a integração entre teoria e prática durante o processo de aprendizagem.</w:t>
+        <w:t xml:space="preserve">Este Projeto Integrador apresenta o Minha Rotina, um aplicativo de organização de rotina para adultos com rotina variável que acabam esquecendo itens ao sair e perdendo prazos curtos. O app foi feito com React Native via Expo, TypeScript e banco SQLite guardado no próprio aparelho. O trabalho junta quatro disciplinas: Programação para Dispositivos Móveis I, Programação Orientada a Objetos, Tópicos Avançados em ADS e Avaliação de Software. O desenvolvimento foi dividido em três sprints de duas semanas, com protótipo das telas antes do código e testes manuais no celular. O resultado é um app simples, em português e sem conta: Inbox para anotar rápido, Hoje com no máximo 3 tarefas, checklist de saída, timer de 25 minutos e revisão da semana.</w:t>
       </w:r>
     </w:p>
     <w:p>
@@ -774,7 +774,7 @@
           <w:sz w:val="24"/>
           <w:szCs w:val="24"/>
         </w:rPr>
-        <w:t xml:space="preserve">This Integrative Project aims to develop a mobile routine organization application aimed at adults aged 18 to 45 with variable routines and prospective memory difficulties, using React Native via Expo, TypeScript and local SQLite. The work addresses the stages of requirements gathering, planning, modeling, development and testing of the application, integrating different areas of information technology, such as Mobile Programming, Object-Oriented Programming, Requirements Engineering and Software Evaluation. For system construction, an incremental development methodology organized in three two-week sprints was adopted, with Git versioning, navigable HTML prototyping and validation by measurable acceptance criteria. The proposed solution is 100% local, in Portuguese, with no account and no internet: capture in a single inbox in less than 10 seconds, day limited to 3 priorities with visual progress bar, exit checklist at the point of action and 25-minute Pomodoro timer per focus block. Furthermore, the project highlights the importance of interdisciplinarity in students’ academic and professional education, bringing them closer to real market demands. As a result, a functional prototype and the application base with local persistence were developed, capable of meeting the proposed objectives, demonstrating the integration between theory and practice throughout the learning process.</w:t>
+        <w:t xml:space="preserve">This Integrative Project presents Minha Rotina, a routine organization app for adults with variable schedules who often forget items when leaving home and miss short deadlines. The app was built with React Native via Expo, TypeScript and SQLite stored on the device. The work brings together four subjects: Mobile Programming I, Object-Oriented Programming, Advanced Topics in Systems Analysis and Development, and Software Evaluation. Development was split into three two-week sprints, with screen prototypes before coding and manual tests on a real phone. The result is a simple app, in Portuguese and with no account needed: Inbox for quick notes, Today limited to 3 tasks, exit checklist, 25-minute timer and weekly review.</w:t>
       </w:r>
     </w:p>
     <w:p>
@@ -1304,7 +1304,7 @@
           <w:sz w:val="24"/>
           <w:szCs w:val="24"/>
         </w:rPr>
-        <w:t xml:space="preserve">Nesse cenário, o desenvolvimento de aplicações móveis que ofereçam captura rápida, definição diária estruturada e registro de atividades surge como alternativa para auxiliar o usuário a organizar seu dia de forma acessível, privada e offline. A mobilidade proporciona acesso rápido às informações, permitindo que atividades antes realizadas em papel ou planilhas sejam executadas de forma digital, segura e eficiente.</w:t>
+        <w:t xml:space="preserve">Nesse cenário, o desenvolvimento de aplicações móveis que ajudem a anotar rápido, escolher poucas prioridades no dia e registrar atividades aparece como ajuda para organizar o dia de um jeito simples. A ideia é trocar papel e anotação espalhada por telas diretas no celular.</w:t>
       </w:r>
     </w:p>
     <w:p>
@@ -1337,22 +1337,22 @@
           <w:sz w:val="24"/>
           <w:szCs w:val="24"/>
         </w:rPr>
-        <w:t xml:space="preserve">: um app 100% local, em português, sem conta e sem internet, que captura em inbox único em menos de 10 segundos, limita o dia a 3 prioridades com barra de progresso visual, oferece checklist de saída no ponto de ação e temporizador de 25 minutos por bloco de foco. O desenvolvimento desta aplicação busca solucionar o problema do esquecimento na saída, da paralisia por excesso de opções e da dispersão de prazos por meio de uma plataforma moderna, simples e com privacidade total, pois todo o dado fica no aparelho.</w:t>
-      </w:r>
-    </w:p>
-    <w:p>
-      <w:pPr>
-        <w:spacing w:after="0" w:line="360" w:lineRule="auto"/>
-        <w:ind w:firstLine="709"/>
-        <w:jc w:val="both"/>
-      </w:pPr>
-      <w:r>
-        <w:rPr>
-          <w:rFonts w:ascii="Times New Roman" w:cs="Times New Roman" w:eastAsia="Times New Roman" w:hAnsi="Times New Roman"/>
-          <w:sz w:val="24"/>
-          <w:szCs w:val="24"/>
-        </w:rPr>
-        <w:t xml:space="preserve">Segundo Pressman e Maxim (2021), quando um software é bem-sucedido — ou seja, quando atende às necessidades dos usuários, opera perfeitamente durante um longo período, é fácil de modificar e mais fácil ainda de utilizar —, ele pode mudar as coisas para melhor. Para alcançar esse nível, os autores defendem uma abordagem de engenharia disciplinada, que inclui levantamento de requisitos, análise, projeto, implementação, verificação e manutenção. Este projeto aplicou esses princípios por meio de requisitos com critérios de aceite mensuráveis (CA-PI01 a CA-PI07) e metodologia incremental.</w:t>
+        <w:t xml:space="preserve">: um app em português, sem conta e com os dados no próprio aparelho, que captura em inbox único em menos de 10 segundos, limita o dia a 3 prioridades com barra de progresso visual, oferece checklist de saída no ponto de ação e temporizador de 25 minutos por bloco de foco. O desenvolvimento desta aplicação busca solucionar o problema do esquecimento na saída, da paralisia por excesso de opções e da dispersão de prazos com telas simples, simples e com privacidade total, pois todo o dado fica no aparelho.</w:t>
+      </w:r>
+    </w:p>
+    <w:p>
+      <w:pPr>
+        <w:spacing w:after="0" w:line="360" w:lineRule="auto"/>
+        <w:ind w:firstLine="709"/>
+        <w:jc w:val="both"/>
+      </w:pPr>
+      <w:r>
+        <w:rPr>
+          <w:rFonts w:ascii="Times New Roman" w:cs="Times New Roman" w:eastAsia="Times New Roman" w:hAnsi="Times New Roman"/>
+          <w:sz w:val="24"/>
+          <w:szCs w:val="24"/>
+        </w:rPr>
+        <w:t xml:space="preserve">Segundo Pressman e Maxim (2021), quando um software é bem-sucedido — ou seja, quando atende às necessidades dos usuários, opera perfeitamente durante um longo período, é fácil de modificar e mais fácil ainda de utilizar —, ele pode mudar as coisas para melhor. Para alcançar esse nível, os autores defendem uma abordagem de engenharia disciplinada, que inclui levantamento de requisitos, análise, projeto, implementação, verificação e manutenção. Este projeto aplicou esses princípios com requisitos com critérios de aceite mensuráveis (CA-PI01 a CA-PI07) e metodologia incremental.</w:t>
       </w:r>
     </w:p>
     <w:p>
@@ -1398,7 +1398,7 @@
           <w:sz w:val="24"/>
           <w:szCs w:val="24"/>
         </w:rPr>
-        <w:t xml:space="preserve">Desenvolver uma aplicação mobile offline de organização de rotina, utilizando React Native via Expo, TypeScript e SQLite local, com foco em captura rápida, definição diária de até 3 prioridades e registro de atividades, proporcionando maior organização, agilidade, privacidade e segurança no controle das informações, sem dependência de conta, nuvem ou internet.</w:t>
+        <w:t xml:space="preserve">Desenvolver um aplicativo de organização de rotina com React Native via Expo, TypeScript e banco guardado no próprio aparelho, com foco em captura rápida, definição diária de até 3 prioridades e registro de atividades, para organizar melhor o dia a dia, sem conta e sem servidor.</w:t>
       </w:r>
     </w:p>
     <w:p>
@@ -1429,7 +1429,7 @@
           <w:sz w:val="24"/>
           <w:szCs w:val="24"/>
         </w:rPr>
-        <w:t xml:space="preserve">•  Implementar tela de Inbox para captura rápida de tarefas em texto livre (máx. 500 caracteres), visível em menos de 10 segundos mesmo offline (RF01, CA-PI01);</w:t>
+        <w:t xml:space="preserve">•  Implementar tela de Inbox para captura rápida de tarefas em texto livre (máx. 500 caracteres), visível em menos de 10 segundos mesmo no próprio aparelho (RF01, CA-PI01);</w:t>
       </w:r>
     </w:p>
     <w:p>
@@ -1519,7 +1519,7 @@
           <w:sz w:val="24"/>
           <w:szCs w:val="24"/>
         </w:rPr>
-        <w:t xml:space="preserve">•  Validar o funcionamento do sistema por meio de 7 critérios de aceite e 10 casos de teste manuais executados em dispositivo Android via QR/APK, com congelamento do código 3 dias antes da banca.</w:t>
+        <w:t xml:space="preserve">•  Validar o funcionamento do sistema com 7 critérios de aceite e 10 casos de teste manuais executados em dispositivo Android via QR/APK, com congelamento do código 3 dias antes da banca.</w:t>
       </w:r>
     </w:p>
     <w:p>
@@ -1611,7 +1611,7 @@
           <w:sz w:val="24"/>
           <w:szCs w:val="24"/>
         </w:rPr>
-        <w:t xml:space="preserve">Na fase de desenvolvimento foi adotada arquitetura 100% local, sem backend, sem sincronização em nuvem e sem coleta de dados, separando responsabilidades entre componentes visuais, serviços e banco SQLite via padrão Singleton. Essa abordagem facilitou a manutenção, garantiu privacidade e tornou o app utilizável sem internet após instalado, conforme RNF03 e CA-PI07.</w:t>
+        <w:t xml:space="preserve">Na fase de desenvolvimento foi adotada arquitetura com os dados guardados no aparelho, sem backend, sem sincronização em nuvem e sem coleta de dados, separando responsabilidades entre componentes visuais, serviços e banco SQLite via padrão Singleton. Essa abordagem facilitou a manutenção, garantiu privacidade e tornou o app utilizável sem internet após instalado, conforme RNF03 e CA-PI07.</w:t>
       </w:r>
     </w:p>
     <w:p>
@@ -1673,7 +1673,7 @@
           <w:sz w:val="24"/>
           <w:szCs w:val="24"/>
         </w:rPr>
-        <w:t xml:space="preserve">Segundo Fazenda (2011), a interdisciplinaridade promove a integração entre diferentes campos do conhecimento, favorecendo uma aprendizagem mais significativa e aproximando o ambiente acadêmico das demandas do mercado de trabalho. Dessa forma, o Projeto Integrador possibilita o desenvolvimento de competências técnicas, analíticas e profissionais por meio da construção de um sistema funcional. Durante este projeto foram integrados conhecimentos de Programação para Dispositivos Móveis I, Programação Orientada a Objetos, Tópicos Avançados em Análise e Desenvolvimento de Sistemas e Avaliação de Software, cada uma contribuindo para diferentes etapas do ciclo de desenvolvimento.</w:t>
+        <w:t xml:space="preserve">Segundo Fazenda (2011), a interdisciplinaridade promove a integração entre diferentes campos do conhecimento, favorecendo uma aprendizagem mais significativa e aproximando o ambiente acadêmico das demandas do mercado de trabalho. Dessa forma, o Projeto Integrador ajuda a juntar o que vimos em cada matéria na construção de um sistema que funciona de verdade. Durante este projeto foram integrados conhecimentos de Programação para Dispositivos Móveis I, Programação Orientada a Objetos, Tópicos Avançados em Análise e Desenvolvimento de Sistemas e Avaliação de Software, cada uma contribuindo para diferentes etapas do ciclo de desenvolvimento.</w:t>
       </w:r>
     </w:p>
     <w:p>
@@ -1719,7 +1719,7 @@
           <w:sz w:val="24"/>
           <w:szCs w:val="24"/>
         </w:rPr>
-        <w:t xml:space="preserve">A disciplina foi responsável por fornecer os conhecimentos para a construção do aplicativo em React Native via Expo com TypeScript e SQLite offline. Foram aplicados conceitos de criação de interfaces modernas, navegação entre telas por abas (Inbox, Hoje, Saída, Timer, Revisão), gerenciamento de estados, integração com banco local e alarmes locais.</w:t>
+        <w:t xml:space="preserve">A disciplina foi responsável por fornecer os conhecimentos para a construção do aplicativo em React Native via Expo com TypeScript e SQLite no próprio aparelho. Foram aplicados conceitos de criação de interfaces modernas, navegação entre telas por abas (Inbox, Hoje, Saída, Timer, Revisão), gerenciamento de estados, integração com banco local e alarmes locais.</w:t>
       </w:r>
     </w:p>
     <w:p>
@@ -1749,7 +1749,7 @@
           <w:sz w:val="24"/>
           <w:szCs w:val="24"/>
         </w:rPr>
-        <w:t xml:space="preserve">Além disso, foram aplicados princípios de design de interfaces e usabilidade: fonte mínima de 16px, botões de toque ≥48dp, formulários responsivos e validação para reduzir erros. Segundo Nielsen (2012), a interface deve proporcionar simplicidade, clareza e facilidade de utilização, e a usabilidade é um atributo de qualidade relacionado à facilidade de uso. Entre as funcionalidades implementadas destacam-se: captura em &lt;10s, mover para o Hoje em 1 toque, exclusão sem confirmação, limite de 3 no Hoje, barra de progresso vermelho→amarelo→verde, checklist ≤5 com 1 toque por item, timer 25:00 com start/pause e revisão semanal offline.</w:t>
+        <w:t xml:space="preserve">Também cuidamos do visual: fonte mínima de 16px, botões de toque ≥48dp, formulários responsivos e validação para reduzir erros. Segundo Nielsen (2012), a interface deve proporcionar simplicidade, clareza e facilidade de utilização, e a usabilidade é um atributo de qualidade relacionado à facilidade de uso. Entre as funcionalidades implementadas destacam-se: captura em &lt;10s, mover para o Hoje em 1 toque, exclusão sem confirmação, limite de 3 no Hoje, barra de progresso vermelho→amarelo→verde, checklist ≤5 com 1 toque por item, timer 25:00 com start/pause e revisão semanal no próprio aparelho.</w:t>
       </w:r>
     </w:p>
     <w:p>
@@ -1872,7 +1872,7 @@
           <w:sz w:val="24"/>
           <w:szCs w:val="24"/>
         </w:rPr>
-        <w:t xml:space="preserve">A disciplina definiu critérios mensuráveis de aceite (CA-PI01 a CA-PI07) e 10 casos de teste manuais, alinhada a Pressman e Maxim (2021), para quem o engenheiro deve avaliar a qualidade, revisar produtos e aplicar estratégias de teste. Os critérios cobrem: Inbox visível em &lt;10s e exclusão sem travar com 50 itens; Hoje limitado a 3 com aviso neutro; checklist em &lt;60s; Pomodoro 25:00 sem resetar ao trocar de aba; humor/sono offline; 2 alarmes locais só se Inbox&gt;0; abertura via QR sem internet e zero crash em 10 minutos.</w:t>
+        <w:t xml:space="preserve">A disciplina definiu critérios mensuráveis de aceite (CA-PI01 a CA-PI07) e 10 casos de teste manuais, alinhada a Pressman e Maxim (2021), para quem o engenheiro deve avaliar a qualidade, revisar produtos e aplicar estratégias de teste. Os critérios cobrem: Inbox visível em &lt;10s e exclusão sem travar com 50 itens; Hoje limitado a 3 com aviso neutro; checklist em &lt;60s; Pomodoro 25:00 sem resetar ao trocar de aba; humor/sono no próprio aparelho; 2 alarmes locais só se Inbox&gt;0; abertura via QR sem internet e zero crash em 10 minutos.</w:t>
       </w:r>
     </w:p>
     <w:p>
@@ -1919,7 +1919,7 @@
           <w:sz w:val="24"/>
           <w:szCs w:val="24"/>
         </w:rPr>
-        <w:t xml:space="preserve">O desenvolvimento envolveu a seleção de tecnologias capazes de atender aos requisitos funcionais e não funcionais com custo zero, privacidade total e execução offline. Foram utilizadas tecnologias modernas amplamente empregadas no mercado, permitindo construção robusta e evolutiva para futuro TCC 2 com backend.</w:t>
+        <w:t xml:space="preserve">O desenvolvimento envolveu a seleção de tecnologias capazes de atender aos requisitos funcionais e não funcionais com custo zero, privacidade total e execução no próprio aparelho. Foram utilizadas tecnologias modernas amplamente empregadas no mercado, permitindo construção robusta e evolutiva para futuro TCC 2 com backend.</w:t>
       </w:r>
     </w:p>
     <w:p>
@@ -2012,7 +2012,7 @@
           <w:sz w:val="24"/>
           <w:szCs w:val="24"/>
         </w:rPr>
-        <w:t xml:space="preserve">O expo-sqlite foi utilizado como banco embarcado, com arquivo minha_rotina.db criado via openDatabaseAsync e tabelas inbox_items (id, content, created_at) e hoje_items (id, inbox_id, checked, created_at com FK). Disponibiliza persistência total no aparelho, consultas SQL para listagem ordenada e JOIN entre hoje e inbox, sem backend. Proporcionou desempenho &lt;2s na navegação, privacidade e funcionamento offline.</w:t>
+        <w:t xml:space="preserve">O expo-sqlite foi utilizado como banco embarcado, com arquivo minha_rotina.db criado via openDatabaseAsync e tabelas inbox_items (id, content, created_at) e hoje_items (id, inbox_id, checked, created_at com FK). Disponibiliza persistência total no aparelho, consultas SQL para listagem ordenada e JOIN entre hoje e inbox, sem backend. Proporcionou desempenho &lt;2s na navegação, privacidade e funcionamento no próprio aparelho.</w:t>
       </w:r>
     </w:p>
     <w:p>
@@ -2978,7 +2978,7 @@
           <w:sz w:val="24"/>
           <w:szCs w:val="24"/>
         </w:rPr>
-        <w:t xml:space="preserve">A tela de Inbox possui campo único no topo (+ Despejar) onde digitar + Enter salva em &lt;10s mesmo offline, com status inbox e timestamp, sem exigir categoria — evitando fadiga de decisão. Cada item tem botões [→ Hoje] (move em 1 toque via insertHojeItem) e [🗑] (deleteInboxItem sem confirmação, sem travar com 50 itens). Meta: zerar o inbox todo dia. O processamento em 4 decisões ([Fazer &lt;2min]/[→Hoje]/[Backlog]/[Lixo]) leva ~10s por item, alinhado a Chen et al. (2015) sobre memória prospectiva.</w:t>
+        <w:t xml:space="preserve">A tela de Inbox possui campo único no topo (+ Despejar) onde digitar + Enter salva em &lt;10s mesmo no próprio aparelho, com status inbox e timestamp, sem exigir categoria — evitando fadiga de decisão. Cada item tem botões [→ Hoje] (move em 1 toque via insertHojeItem) e [🗑] (deleteInboxItem sem confirmação, sem travar com 50 itens). Meta: zerar o inbox todo dia. O processamento em 4 decisões ([Fazer &lt;2min]/[→Hoje]/[Backlog]/[Lixo]) leva ~10s por item, alinhado a Chen et al. (2015) sobre memória prospectiva.</w:t>
       </w:r>
     </w:p>
     <w:p>
@@ -3102,7 +3102,7 @@
           <w:sz w:val="24"/>
           <w:szCs w:val="24"/>
         </w:rPr>
-        <w:t xml:space="preserve">Exibe resumo: Inbox zerado 4/7 dias, saídas registradas, média de saída (ex.: 8h07), com registro offline de humor/sono e campo de 1 ajuste para semana seguinte + botão Concluir Semana. Permite busca, filtros e visualização detalhada/edição, com dados recuperados via SQLite e apresentados em tempo real.</w:t>
+        <w:t xml:space="preserve">Exibe resumo: Inbox zerado 4/7 dias, saídas registradas, média de saída (ex.: 8h07), com registro no próprio aparelho de humor/sono e campo de 1 ajuste para semana seguinte + botão Concluir Semana. Permite busca, filtros e visualização detalhada/edição, com dados recuperados via SQLite e apresentados em tempo real.</w:t>
       </w:r>
     </w:p>
     <w:p>
@@ -3519,7 +3519,7 @@
                 <w:sz w:val="20"/>
                 <w:szCs w:val="20"/>
               </w:rPr>
-              <w:t xml:space="preserve">Humor/sono offline; conta inbox zerado</w:t>
+              <w:t xml:space="preserve">Humor/sono no próprio aparelho; conta inbox zerado</w:t>
             </w:r>
           </w:p>
         </w:tc>
@@ -3712,37 +3712,37 @@
           <w:sz w:val="24"/>
           <w:szCs w:val="24"/>
         </w:rPr>
-        <w:t xml:space="preserve">O desenvolvimento do Projeto Integrador possibilitou a aplicação prática dos conhecimentos adquiridos ao longo do curso, promovendo a integração entre Programação para Dispositivos Móveis I, Programação Orientada a Objetos, Tópicos Avançados e Avaliação de Software, e proporcionando experiência próxima da realidade do mercado com restrição real de prazo (6 semanas), equipe de 2, orçamento zero e stack travada.</w:t>
-      </w:r>
-    </w:p>
-    <w:p>
-      <w:pPr>
-        <w:spacing w:after="0" w:line="360" w:lineRule="auto"/>
-        <w:ind w:firstLine="709"/>
-        <w:jc w:val="both"/>
-      </w:pPr>
-      <w:r>
-        <w:rPr>
-          <w:rFonts w:ascii="Times New Roman" w:cs="Times New Roman" w:eastAsia="Times New Roman" w:hAnsi="Times New Roman"/>
-          <w:sz w:val="24"/>
-          <w:szCs w:val="24"/>
-        </w:rPr>
-        <w:t xml:space="preserve">O sistema apresentou-se como solução viável para adultos com rotina variável e dificuldades de memória prospectiva ao combinar captura &lt;10s, limite de 3 no Hoje com barra visual, checklist de porta ≤5 e Pomodoro 25 min, tudo 100% local em português, validado por 7 critérios de aceite e protótipo navegável.</w:t>
-      </w:r>
-    </w:p>
-    <w:p>
-      <w:pPr>
-        <w:spacing w:after="0" w:line="360" w:lineRule="auto"/>
-        <w:ind w:firstLine="709"/>
-        <w:jc w:val="both"/>
-      </w:pPr>
-      <w:r>
-        <w:rPr>
-          <w:rFonts w:ascii="Times New Roman" w:cs="Times New Roman" w:eastAsia="Times New Roman" w:hAnsi="Times New Roman"/>
-          <w:sz w:val="24"/>
-          <w:szCs w:val="24"/>
-        </w:rPr>
-        <w:t xml:space="preserve">Como trabalhos futuros ficam: backend com sincronização segura, IA para sugerir as 3 do Hoje, gamificação leve não monetizada, expansão iOS e wearable, citados em 1 frase como escala TCC 2 sem comprometer escopo atual. O projeto reforçou a interdisciplinaridade como diferencial competitivo e base reutilizável para evolução.</w:t>
+        <w:t xml:space="preserve">O desenvolvimento do Projeto Integrador juntou o que vimos nas matérias de Programação para Dispositivos Móveis I, Programação Orientada a Objetos, Tópicos Avançados e Avaliação de Software, e deu uma experiência parecida com trabalho real, com prazo curto (6 semanas), equipe de 2 e orçamento zero.</w:t>
+      </w:r>
+    </w:p>
+    <w:p>
+      <w:pPr>
+        <w:spacing w:after="0" w:line="360" w:lineRule="auto"/>
+        <w:ind w:firstLine="709"/>
+        <w:jc w:val="both"/>
+      </w:pPr>
+      <w:r>
+        <w:rPr>
+          <w:rFonts w:ascii="Times New Roman" w:cs="Times New Roman" w:eastAsia="Times New Roman" w:hAnsi="Times New Roman"/>
+          <w:sz w:val="24"/>
+          <w:szCs w:val="24"/>
+        </w:rPr>
+        <w:t xml:space="preserve">O app funcionou bem para quem tem rotina picada e esquece coisa na saída, ao combinar captura &lt;10s, limite de 3 no Hoje com barra visual, checklist de porta ≤5 e Pomodoro 25 min, tudo com os dados guardados no aparelho em português, validado por 7 critérios de aceite e protótipo navegável.</w:t>
+      </w:r>
+    </w:p>
+    <w:p>
+      <w:pPr>
+        <w:spacing w:after="0" w:line="360" w:lineRule="auto"/>
+        <w:ind w:firstLine="709"/>
+        <w:jc w:val="both"/>
+      </w:pPr>
+      <w:r>
+        <w:rPr>
+          <w:rFonts w:ascii="Times New Roman" w:cs="Times New Roman" w:eastAsia="Times New Roman" w:hAnsi="Times New Roman"/>
+          <w:sz w:val="24"/>
+          <w:szCs w:val="24"/>
+        </w:rPr>
+        <w:t xml:space="preserve">Como trabalhos futuros ficam: backend com sincronização segura, IA para sugerir as 3 do Hoje, gamificação leve não monetizada, expansão iOS e wearable, citados em 1 frase como escala TCC 2 sem comprometer escopo atual. O projeto reforçou que juntar as matérias ajuda a entregar funcionando e deixou base para continuar no TCC 2.</w:t>
       </w:r>
     </w:p>
     <w:p>

</xml_diff>